<commit_message>
added a new dataset and trained new models relative to it
</commit_message>
<xml_diff>
--- a/rapport_diagnostic_moteur_dc.docx
+++ b/rapport_diagnostic_moteur_dc.docx
@@ -23,7 +23,51 @@
           <w:szCs w:val="48"/>
           <w:lang w:val="fr-FR"/>
         </w:rPr>
-        <w:t>Petit rapport sur le 1ere essaie d’entrainement IA</w:t>
+        <w:t>Petit rapport sur l</w:t>
+      </w:r>
+      <w:r>
+        <w:rPr>
+          <w:b/>
+          <w:bCs/>
+          <w:color w:val="1F4E79"/>
+          <w:sz w:val="48"/>
+          <w:szCs w:val="48"/>
+          <w:lang w:val="fr-FR"/>
+        </w:rPr>
+        <w:t>a</w:t>
+      </w:r>
+      <w:r>
+        <w:rPr>
+          <w:b/>
+          <w:bCs/>
+          <w:color w:val="1F4E79"/>
+          <w:sz w:val="48"/>
+          <w:szCs w:val="48"/>
+          <w:lang w:val="fr-FR"/>
+        </w:rPr>
+        <w:t xml:space="preserve"> 1</w:t>
+      </w:r>
+      <w:r>
+        <w:rPr>
+          <w:b/>
+          <w:bCs/>
+          <w:color w:val="1F4E79"/>
+          <w:sz w:val="48"/>
+          <w:szCs w:val="48"/>
+          <w:lang w:val="fr-FR"/>
+        </w:rPr>
+        <w:t>é</w:t>
+      </w:r>
+      <w:r>
+        <w:rPr>
+          <w:b/>
+          <w:bCs/>
+          <w:color w:val="1F4E79"/>
+          <w:sz w:val="48"/>
+          <w:szCs w:val="48"/>
+          <w:lang w:val="fr-FR"/>
+        </w:rPr>
+        <w:t>re essaie d’entrainement IA</w:t>
       </w:r>
     </w:p>
     <w:p>
@@ -118,14 +162,7 @@
           <w:color w:val="404040"/>
           <w:lang w:val="fr-FR"/>
         </w:rPr>
-        <w:t>Année</w:t>
-      </w:r>
-      <w:r>
-        <w:rPr>
-          <w:color w:val="404040"/>
-          <w:lang w:val="fr-FR"/>
-        </w:rPr>
-        <w:t xml:space="preserve"> universitaire : 202</w:t>
+        <w:t>Année universitaire : 202</w:t>
       </w:r>
       <w:r>
         <w:rPr>
@@ -229,191 +266,25 @@
                 <w:szCs w:val="20"/>
                 <w:lang w:val="fr-FR"/>
               </w:rPr>
-              <w:t>Développer</w:t>
-            </w:r>
+              <w:t xml:space="preserve">Développer un système de diagnostic intelligent capable de détecter automatiquement les types de pannes d'un moteur DC 12V à partir de données issues de 3 capteurs : courant, tension et vitesse. Comparer 5 à 6 algorithmes de Machine Learning et proposer deux versions complémentaires : une basée sur les labels réels </w:t>
+            </w:r>
+            <w:proofErr w:type="gramStart"/>
             <w:r>
               <w:rPr>
                 <w:sz w:val="20"/>
                 <w:szCs w:val="20"/>
                 <w:lang w:val="fr-FR"/>
               </w:rPr>
-              <w:t xml:space="preserve"> un </w:t>
-            </w:r>
+              <w:t>du datasheet</w:t>
+            </w:r>
+            <w:proofErr w:type="gramEnd"/>
             <w:r>
               <w:rPr>
                 <w:sz w:val="20"/>
                 <w:szCs w:val="20"/>
                 <w:lang w:val="fr-FR"/>
               </w:rPr>
-              <w:t>système</w:t>
-            </w:r>
-            <w:r>
-              <w:rPr>
-                <w:sz w:val="20"/>
-                <w:szCs w:val="20"/>
-                <w:lang w:val="fr-FR"/>
-              </w:rPr>
-              <w:t xml:space="preserve"> de diagnostic intelligent capable de </w:t>
-            </w:r>
-            <w:r>
-              <w:rPr>
-                <w:sz w:val="20"/>
-                <w:szCs w:val="20"/>
-                <w:lang w:val="fr-FR"/>
-              </w:rPr>
-              <w:t>détecter</w:t>
-            </w:r>
-            <w:r>
-              <w:rPr>
-                <w:sz w:val="20"/>
-                <w:szCs w:val="20"/>
-                <w:lang w:val="fr-FR"/>
-              </w:rPr>
-              <w:t xml:space="preserve"> automatiquement les types de pannes d'un moteur DC 12V </w:t>
-            </w:r>
-            <w:r>
-              <w:rPr>
-                <w:sz w:val="20"/>
-                <w:szCs w:val="20"/>
-                <w:lang w:val="fr-FR"/>
-              </w:rPr>
-              <w:t>à</w:t>
-            </w:r>
-            <w:r>
-              <w:rPr>
-                <w:sz w:val="20"/>
-                <w:szCs w:val="20"/>
-                <w:lang w:val="fr-FR"/>
-              </w:rPr>
-              <w:t xml:space="preserve"> partir de </w:t>
-            </w:r>
-            <w:r>
-              <w:rPr>
-                <w:sz w:val="20"/>
-                <w:szCs w:val="20"/>
-                <w:lang w:val="fr-FR"/>
-              </w:rPr>
-              <w:t>données</w:t>
-            </w:r>
-            <w:r>
-              <w:rPr>
-                <w:sz w:val="20"/>
-                <w:szCs w:val="20"/>
-                <w:lang w:val="fr-FR"/>
-              </w:rPr>
-              <w:t xml:space="preserve"> issues de 3 capteurs : courant, tension et vitesse. Comparer 5 </w:t>
-            </w:r>
-            <w:r>
-              <w:rPr>
-                <w:sz w:val="20"/>
-                <w:szCs w:val="20"/>
-                <w:lang w:val="fr-FR"/>
-              </w:rPr>
-              <w:t>à</w:t>
-            </w:r>
-            <w:r>
-              <w:rPr>
-                <w:sz w:val="20"/>
-                <w:szCs w:val="20"/>
-                <w:lang w:val="fr-FR"/>
-              </w:rPr>
-              <w:t xml:space="preserve"> 6 algorithmes de Machine Learning et proposer deux versions </w:t>
-            </w:r>
-            <w:r>
-              <w:rPr>
-                <w:sz w:val="20"/>
-                <w:szCs w:val="20"/>
-                <w:lang w:val="fr-FR"/>
-              </w:rPr>
-              <w:t>complémentaires</w:t>
-            </w:r>
-            <w:r>
-              <w:rPr>
-                <w:sz w:val="20"/>
-                <w:szCs w:val="20"/>
-                <w:lang w:val="fr-FR"/>
-              </w:rPr>
-              <w:t xml:space="preserve"> : une </w:t>
-            </w:r>
-            <w:r>
-              <w:rPr>
-                <w:sz w:val="20"/>
-                <w:szCs w:val="20"/>
-                <w:lang w:val="fr-FR"/>
-              </w:rPr>
-              <w:t>basée</w:t>
-            </w:r>
-            <w:r>
-              <w:rPr>
-                <w:sz w:val="20"/>
-                <w:szCs w:val="20"/>
-                <w:lang w:val="fr-FR"/>
-              </w:rPr>
-              <w:t xml:space="preserve"> sur les labels </w:t>
-            </w:r>
-            <w:r>
-              <w:rPr>
-                <w:sz w:val="20"/>
-                <w:szCs w:val="20"/>
-                <w:lang w:val="fr-FR"/>
-              </w:rPr>
-              <w:t>réels</w:t>
-            </w:r>
-            <w:r>
-              <w:rPr>
-                <w:sz w:val="20"/>
-                <w:szCs w:val="20"/>
-                <w:lang w:val="fr-FR"/>
-              </w:rPr>
-              <w:t xml:space="preserve"> du </w:t>
-            </w:r>
-            <w:r>
-              <w:rPr>
-                <w:sz w:val="20"/>
-                <w:szCs w:val="20"/>
-                <w:lang w:val="fr-FR"/>
-              </w:rPr>
-              <w:t>datasheet</w:t>
-            </w:r>
-            <w:r>
-              <w:rPr>
-                <w:sz w:val="20"/>
-                <w:szCs w:val="20"/>
-                <w:lang w:val="fr-FR"/>
-              </w:rPr>
-              <w:t xml:space="preserve"> et une </w:t>
-            </w:r>
-            <w:r>
-              <w:rPr>
-                <w:sz w:val="20"/>
-                <w:szCs w:val="20"/>
-                <w:lang w:val="fr-FR"/>
-              </w:rPr>
-              <w:t>basée</w:t>
-            </w:r>
-            <w:r>
-              <w:rPr>
-                <w:sz w:val="20"/>
-                <w:szCs w:val="20"/>
-                <w:lang w:val="fr-FR"/>
-              </w:rPr>
-              <w:t xml:space="preserve"> sur des formules physiques </w:t>
-            </w:r>
-            <w:r>
-              <w:rPr>
-                <w:sz w:val="20"/>
-                <w:szCs w:val="20"/>
-                <w:lang w:val="fr-FR"/>
-              </w:rPr>
-              <w:t>réalistes</w:t>
-            </w:r>
-            <w:r>
-              <w:rPr>
-                <w:sz w:val="20"/>
-                <w:szCs w:val="20"/>
-                <w:lang w:val="fr-FR"/>
-              </w:rPr>
-              <w:t>.</w:t>
+              <w:t xml:space="preserve"> et une basée sur des formules physiques réalistes.</w:t>
             </w:r>
           </w:p>
         </w:tc>
@@ -505,7 +376,39 @@
           <w:color w:val="000000"/>
           <w:lang w:val="fr-FR"/>
         </w:rPr>
-        <w:t xml:space="preserve"> electrique et mecanique. Les moteurs a courant continu (DC) 12V sont largement utilises dans les systemes embarques, la robotique et l'automatisation industrielle. Leur defaillance peut provoquer des arrets de production couteux ou des situations dangereuses.</w:t>
+        <w:t xml:space="preserve"> electrique et mecanique. Les moteurs </w:t>
+      </w:r>
+      <w:proofErr w:type="gramStart"/>
+      <w:r>
+        <w:rPr>
+          <w:color w:val="000000"/>
+          <w:lang w:val="fr-FR"/>
+        </w:rPr>
+        <w:t>a courant</w:t>
+      </w:r>
+      <w:proofErr w:type="gramEnd"/>
+      <w:r>
+        <w:rPr>
+          <w:color w:val="000000"/>
+          <w:lang w:val="fr-FR"/>
+        </w:rPr>
+        <w:t xml:space="preserve"> continu (DC) 12V sont largement utilises dans les systemes embarques, la robotique et l'automatisation industrielle. Leur defaillance peut provoquer des arrets de </w:t>
+      </w:r>
+      <w:proofErr w:type="gramStart"/>
+      <w:r>
+        <w:rPr>
+          <w:color w:val="000000"/>
+          <w:lang w:val="fr-FR"/>
+        </w:rPr>
+        <w:t>production couteux</w:t>
+      </w:r>
+      <w:proofErr w:type="gramEnd"/>
+      <w:r>
+        <w:rPr>
+          <w:color w:val="000000"/>
+          <w:lang w:val="fr-FR"/>
+        </w:rPr>
+        <w:t xml:space="preserve"> ou des situations dangereuses.</w:t>
       </w:r>
     </w:p>
     <w:p>
@@ -2604,7 +2507,23 @@
                 <w:sz w:val="20"/>
                 <w:szCs w:val="20"/>
               </w:rPr>
-              <w:t>Caracteristiques spectrales [0..1]</w:t>
+              <w:t>Caracteristiques spectrales [</w:t>
+            </w:r>
+            <w:proofErr w:type="gramStart"/>
+            <w:r>
+              <w:rPr>
+                <w:sz w:val="20"/>
+                <w:szCs w:val="20"/>
+              </w:rPr>
+              <w:t>0..</w:t>
+            </w:r>
+            <w:proofErr w:type="gramEnd"/>
+            <w:r>
+              <w:rPr>
+                <w:sz w:val="20"/>
+                <w:szCs w:val="20"/>
+              </w:rPr>
+              <w:t>1]</w:t>
             </w:r>
           </w:p>
         </w:tc>
@@ -2776,7 +2695,23 @@
                 <w:sz w:val="20"/>
                 <w:szCs w:val="20"/>
               </w:rPr>
-              <w:t>Score d'anomalie [0..1]</w:t>
+              <w:t>Score d'anomalie [</w:t>
+            </w:r>
+            <w:proofErr w:type="gramStart"/>
+            <w:r>
+              <w:rPr>
+                <w:sz w:val="20"/>
+                <w:szCs w:val="20"/>
+              </w:rPr>
+              <w:t>0..</w:t>
+            </w:r>
+            <w:proofErr w:type="gramEnd"/>
+            <w:r>
+              <w:rPr>
+                <w:sz w:val="20"/>
+                <w:szCs w:val="20"/>
+              </w:rPr>
+              <w:t>1]</w:t>
             </w:r>
           </w:p>
         </w:tc>
@@ -3627,8 +3562,20 @@
                 <w:sz w:val="20"/>
                 <w:szCs w:val="20"/>
               </w:rPr>
-              <w:t>Signal discriminant ?</w:t>
-            </w:r>
+              <w:t xml:space="preserve">Signal </w:t>
+            </w:r>
+            <w:proofErr w:type="gramStart"/>
+            <w:r>
+              <w:rPr>
+                <w:b/>
+                <w:bCs/>
+                <w:color w:val="FFFFFF"/>
+                <w:sz w:val="20"/>
+                <w:szCs w:val="20"/>
+              </w:rPr>
+              <w:t>discriminant ?</w:t>
+            </w:r>
+            <w:proofErr w:type="gramEnd"/>
           </w:p>
         </w:tc>
       </w:tr>
@@ -4678,7 +4625,23 @@
           <w:color w:val="000000"/>
           <w:lang w:val="fr-FR"/>
         </w:rPr>
-        <w:t>Le projet a evolue a travers plusieurs versions successives. Chaque version a apporte des corrections et des ameliorations basees sur l'analyse des resultats precedents.</w:t>
+        <w:t xml:space="preserve">Le projet a evolue a travers plusieurs versions successives. Chaque version a </w:t>
+      </w:r>
+      <w:proofErr w:type="gramStart"/>
+      <w:r>
+        <w:rPr>
+          <w:color w:val="000000"/>
+          <w:lang w:val="fr-FR"/>
+        </w:rPr>
+        <w:t>apporte</w:t>
+      </w:r>
+      <w:proofErr w:type="gramEnd"/>
+      <w:r>
+        <w:rPr>
+          <w:color w:val="000000"/>
+          <w:lang w:val="fr-FR"/>
+        </w:rPr>
+        <w:t xml:space="preserve"> des corrections et des ameliorations basees sur l'analyse des resultats precedents.</w:t>
       </w:r>
     </w:p>
     <w:p>
@@ -4711,8 +4674,16 @@
         <w:rPr>
           <w:color w:val="000000"/>
         </w:rPr>
-        <w:t>Fonctionnalites initiales :</w:t>
+        <w:t xml:space="preserve">Fonctionnalites </w:t>
       </w:r>
+      <w:proofErr w:type="gramStart"/>
+      <w:r>
+        <w:rPr>
+          <w:color w:val="000000"/>
+        </w:rPr>
+        <w:t>initiales :</w:t>
+      </w:r>
+      <w:proofErr w:type="gramEnd"/>
     </w:p>
     <w:p>
       <w:pPr>
@@ -4803,7 +4774,21 @@
         <w:rPr>
           <w:lang w:val="fr-FR"/>
         </w:rPr>
-        <w:t>Transformation du script en fichier .ipynb structure en 11 sections</w:t>
+        <w:t xml:space="preserve">Transformation du script en </w:t>
+      </w:r>
+      <w:proofErr w:type="gramStart"/>
+      <w:r>
+        <w:rPr>
+          <w:lang w:val="fr-FR"/>
+        </w:rPr>
+        <w:t>fichier .ipynb</w:t>
+      </w:r>
+      <w:proofErr w:type="gramEnd"/>
+      <w:r>
+        <w:rPr>
+          <w:lang w:val="fr-FR"/>
+        </w:rPr>
+        <w:t xml:space="preserve"> structure en 11 sections</w:t>
       </w:r>
     </w:p>
     <w:p>
@@ -4854,7 +4839,21 @@
         <w:rPr>
           <w:lang w:val="fr-FR"/>
         </w:rPr>
-        <w:t>Fonction predict_fault() pour la demonstration</w:t>
+        <w:t>Fonction predict_</w:t>
+      </w:r>
+      <w:proofErr w:type="gramStart"/>
+      <w:r>
+        <w:rPr>
+          <w:lang w:val="fr-FR"/>
+        </w:rPr>
+        <w:t>fault(</w:t>
+      </w:r>
+      <w:proofErr w:type="gramEnd"/>
+      <w:r>
+        <w:rPr>
+          <w:lang w:val="fr-FR"/>
+        </w:rPr>
+        <w:t>) pour la demonstration</w:t>
       </w:r>
     </w:p>
     <w:p>
@@ -4882,7 +4881,23 @@
         <w:spacing w:before="40" w:after="60"/>
       </w:pPr>
       <w:r>
-        <w:t>Suppression de tout le code specifique a Colab (drive.mount, files.upload/download)</w:t>
+        <w:t>Suppression de tout le code specifique a Colab (</w:t>
+      </w:r>
+      <w:proofErr w:type="gramStart"/>
+      <w:r>
+        <w:t>drive.mount</w:t>
+      </w:r>
+      <w:proofErr w:type="gramEnd"/>
+      <w:r>
+        <w:t xml:space="preserve">, </w:t>
+      </w:r>
+      <w:proofErr w:type="gramStart"/>
+      <w:r>
+        <w:t>files.upload</w:t>
+      </w:r>
+      <w:proofErr w:type="gramEnd"/>
+      <w:r>
+        <w:t>/download)</w:t>
       </w:r>
     </w:p>
     <w:p>
@@ -4914,7 +4929,35 @@
         <w:rPr>
           <w:lang w:val="fr-FR"/>
         </w:rPr>
-        <w:t>Chemins locaux avec os.path.join() — compatible Windows/Linux/Mac</w:t>
+        <w:t xml:space="preserve">Chemins locaux avec </w:t>
+      </w:r>
+      <w:proofErr w:type="gramStart"/>
+      <w:r>
+        <w:rPr>
+          <w:lang w:val="fr-FR"/>
+        </w:rPr>
+        <w:t>os.path</w:t>
+      </w:r>
+      <w:proofErr w:type="gramEnd"/>
+      <w:r>
+        <w:rPr>
+          <w:lang w:val="fr-FR"/>
+        </w:rPr>
+        <w:t>.</w:t>
+      </w:r>
+      <w:proofErr w:type="gramStart"/>
+      <w:r>
+        <w:rPr>
+          <w:lang w:val="fr-FR"/>
+        </w:rPr>
+        <w:t>join(</w:t>
+      </w:r>
+      <w:proofErr w:type="gramEnd"/>
+      <w:r>
+        <w:rPr>
+          <w:lang w:val="fr-FR"/>
+        </w:rPr>
+        <w:t>) — compatible Windows/Linux/Mac</w:t>
       </w:r>
     </w:p>
     <w:p>
@@ -5134,13 +5177,23 @@
                 <w:lang w:val="fr-FR"/>
               </w:rPr>
             </w:pPr>
+            <w:proofErr w:type="gramStart"/>
             <w:r>
               <w:rPr>
                 <w:sz w:val="20"/>
                 <w:szCs w:val="20"/>
                 <w:lang w:val="fr-FR"/>
               </w:rPr>
-              <w:t>le.classes_ contenant des float</w:t>
+              <w:t>le.classes</w:t>
+            </w:r>
+            <w:proofErr w:type="gramEnd"/>
+            <w:r>
+              <w:rPr>
+                <w:sz w:val="20"/>
+                <w:szCs w:val="20"/>
+                <w:lang w:val="fr-FR"/>
+              </w:rPr>
+              <w:t>_ contenant des float</w:t>
             </w:r>
           </w:p>
         </w:tc>
@@ -5167,7 +5220,23 @@
                 <w:sz w:val="20"/>
                 <w:szCs w:val="20"/>
               </w:rPr>
-              <w:t>CLASS_NAMES = [str(c) for c in le.classes_]</w:t>
+              <w:t xml:space="preserve">CLASS_NAMES = [str(c) for c in </w:t>
+            </w:r>
+            <w:proofErr w:type="gramStart"/>
+            <w:r>
+              <w:rPr>
+                <w:sz w:val="20"/>
+                <w:szCs w:val="20"/>
+              </w:rPr>
+              <w:t>le.classes</w:t>
+            </w:r>
+            <w:proofErr w:type="gramEnd"/>
+            <w:r>
+              <w:rPr>
+                <w:sz w:val="20"/>
+                <w:szCs w:val="20"/>
+              </w:rPr>
+              <w:t>_]</w:t>
             </w:r>
           </w:p>
         </w:tc>
@@ -5262,7 +5331,23 @@
                 <w:sz w:val="20"/>
                 <w:szCs w:val="20"/>
               </w:rPr>
-              <w:t>np.nan_to_num(X, nan=0.0, posinf=0.0, neginf=0.0)</w:t>
+              <w:t>np.nan_to_</w:t>
+            </w:r>
+            <w:proofErr w:type="gramStart"/>
+            <w:r>
+              <w:rPr>
+                <w:sz w:val="20"/>
+                <w:szCs w:val="20"/>
+              </w:rPr>
+              <w:t>num(</w:t>
+            </w:r>
+            <w:proofErr w:type="gramEnd"/>
+            <w:r>
+              <w:rPr>
+                <w:sz w:val="20"/>
+                <w:szCs w:val="20"/>
+              </w:rPr>
+              <w:t>X, nan=0.0, posinf=0.0, neginf=0.0)</w:t>
             </w:r>
           </w:p>
         </w:tc>
@@ -5351,13 +5436,23 @@
                 <w:lang w:val="fr-FR"/>
               </w:rPr>
             </w:pPr>
+            <w:proofErr w:type="gramStart"/>
             <w:r>
               <w:rPr>
                 <w:sz w:val="20"/>
                 <w:szCs w:val="20"/>
                 <w:lang w:val="fr-FR"/>
               </w:rPr>
-              <w:t>zero_division=0 dans toutes les metriques</w:t>
+              <w:t>zero</w:t>
+            </w:r>
+            <w:proofErr w:type="gramEnd"/>
+            <w:r>
+              <w:rPr>
+                <w:sz w:val="20"/>
+                <w:szCs w:val="20"/>
+                <w:lang w:val="fr-FR"/>
+              </w:rPr>
+              <w:t>_division=0 dans toutes les metriques</w:t>
             </w:r>
           </w:p>
         </w:tc>
@@ -5440,7 +5535,23 @@
                 <w:sz w:val="20"/>
                 <w:szCs w:val="20"/>
               </w:rPr>
-              <w:t>Guard hasattr(mlp, 'loss_curve_')</w:t>
+              <w:t xml:space="preserve">Guard </w:t>
+            </w:r>
+            <w:proofErr w:type="gramStart"/>
+            <w:r>
+              <w:rPr>
+                <w:sz w:val="20"/>
+                <w:szCs w:val="20"/>
+              </w:rPr>
+              <w:t>hasattr(</w:t>
+            </w:r>
+            <w:proofErr w:type="gramEnd"/>
+            <w:r>
+              <w:rPr>
+                <w:sz w:val="20"/>
+                <w:szCs w:val="20"/>
+              </w:rPr>
+              <w:t>mlp, 'loss_curve_')</w:t>
             </w:r>
           </w:p>
         </w:tc>
@@ -5469,7 +5580,23 @@
                 <w:sz w:val="20"/>
                 <w:szCs w:val="20"/>
               </w:rPr>
-              <w:t>predict_fault() mal callee</w:t>
+              <w:t>predict_</w:t>
+            </w:r>
+            <w:proofErr w:type="gramStart"/>
+            <w:r>
+              <w:rPr>
+                <w:sz w:val="20"/>
+                <w:szCs w:val="20"/>
+              </w:rPr>
+              <w:t>fault(</w:t>
+            </w:r>
+            <w:proofErr w:type="gramEnd"/>
+            <w:r>
+              <w:rPr>
+                <w:sz w:val="20"/>
+                <w:szCs w:val="20"/>
+              </w:rPr>
+              <w:t>) mal callee</w:t>
             </w:r>
           </w:p>
         </w:tc>
@@ -5588,7 +5715,15 @@
         <w:spacing w:before="40" w:after="60"/>
       </w:pPr>
       <w:r>
-        <w:t>Fault_Status == 0 genere Fault_Type = NaN : correction par label construction</w:t>
+        <w:t xml:space="preserve">Fault_Status == 0 genere Fault_Type = </w:t>
+      </w:r>
+      <w:proofErr w:type="gramStart"/>
+      <w:r>
+        <w:t>NaN :</w:t>
+      </w:r>
+      <w:proofErr w:type="gramEnd"/>
+      <w:r>
+        <w:t xml:space="preserve"> correction par label construction</w:t>
       </w:r>
     </w:p>
     <w:p>
@@ -5605,7 +5740,47 @@
           <w:szCs w:val="18"/>
         </w:rPr>
         <w:lastRenderedPageBreak/>
-        <w:t>df["Label"] = df.apply(lambda r: "Normal" if r["Fault_Status"]==0 else str(r["Fault_Type"]), axis=1)</w:t>
+        <w:t xml:space="preserve">df["Label"] = </w:t>
+      </w:r>
+      <w:proofErr w:type="gramStart"/>
+      <w:r>
+        <w:rPr>
+          <w:rFonts w:ascii="Courier New" w:eastAsia="Courier New" w:hAnsi="Courier New" w:cs="Courier New"/>
+          <w:color w:val="1F4E79"/>
+          <w:sz w:val="18"/>
+          <w:szCs w:val="18"/>
+        </w:rPr>
+        <w:t>df.apply</w:t>
+      </w:r>
+      <w:proofErr w:type="gramEnd"/>
+      <w:r>
+        <w:rPr>
+          <w:rFonts w:ascii="Courier New" w:eastAsia="Courier New" w:hAnsi="Courier New" w:cs="Courier New"/>
+          <w:color w:val="1F4E79"/>
+          <w:sz w:val="18"/>
+          <w:szCs w:val="18"/>
+        </w:rPr>
+        <w:t>(lambda r: "Normal" if r["Fault_Status</w:t>
+      </w:r>
+      <w:proofErr w:type="gramStart"/>
+      <w:r>
+        <w:rPr>
+          <w:rFonts w:ascii="Courier New" w:eastAsia="Courier New" w:hAnsi="Courier New" w:cs="Courier New"/>
+          <w:color w:val="1F4E79"/>
+          <w:sz w:val="18"/>
+          <w:szCs w:val="18"/>
+        </w:rPr>
+        <w:t>"]=</w:t>
+      </w:r>
+      <w:proofErr w:type="gramEnd"/>
+      <w:r>
+        <w:rPr>
+          <w:rFonts w:ascii="Courier New" w:eastAsia="Courier New" w:hAnsi="Courier New" w:cs="Courier New"/>
+          <w:color w:val="1F4E79"/>
+          <w:sz w:val="18"/>
+          <w:szCs w:val="18"/>
+        </w:rPr>
+        <w:t>=0 else str(r["Fault_Type"]), axis=1)</w:t>
       </w:r>
     </w:p>
     <w:p>
@@ -5618,7 +5793,15 @@
         <w:spacing w:before="40" w:after="60"/>
       </w:pPr>
       <w:r>
-        <w:t>4 classes finales propres : Normal, Electrical Fault, Overheating, Mechanical Failure</w:t>
+        <w:t xml:space="preserve">4 classes finales </w:t>
+      </w:r>
+      <w:proofErr w:type="gramStart"/>
+      <w:r>
+        <w:t>propres :</w:t>
+      </w:r>
+      <w:proofErr w:type="gramEnd"/>
+      <w:r>
+        <w:t xml:space="preserve"> Normal, Electrical Fault, Overheating, Mechanical Failure</w:t>
       </w:r>
     </w:p>
     <w:p>
@@ -5671,11 +5854,33 @@
           <w:lang w:val="fr-FR"/>
         </w:rPr>
       </w:pPr>
+      <w:proofErr w:type="gramStart"/>
       <w:r>
         <w:rPr>
           <w:lang w:val="fr-FR"/>
         </w:rPr>
-        <w:t>predict_fault() avec les 13 parametres reels</w:t>
+        <w:t>predict</w:t>
+      </w:r>
+      <w:proofErr w:type="gramEnd"/>
+      <w:r>
+        <w:rPr>
+          <w:lang w:val="fr-FR"/>
+        </w:rPr>
+        <w:t>_</w:t>
+      </w:r>
+      <w:proofErr w:type="gramStart"/>
+      <w:r>
+        <w:rPr>
+          <w:lang w:val="fr-FR"/>
+        </w:rPr>
+        <w:t>fault(</w:t>
+      </w:r>
+      <w:proofErr w:type="gramEnd"/>
+      <w:r>
+        <w:rPr>
+          <w:lang w:val="fr-FR"/>
+        </w:rPr>
+        <w:t>) avec les 13 parametres reels</w:t>
       </w:r>
     </w:p>
     <w:p>
@@ -5783,8 +5988,18 @@
           <w:bCs/>
           <w:color w:val="000000"/>
         </w:rPr>
-        <w:t>Resultats catastrophiques :</w:t>
+        <w:t xml:space="preserve">Resultats </w:t>
       </w:r>
+      <w:proofErr w:type="gramStart"/>
+      <w:r>
+        <w:rPr>
+          <w:b/>
+          <w:bCs/>
+          <w:color w:val="000000"/>
+        </w:rPr>
+        <w:t>catastrophiques :</w:t>
+      </w:r>
+      <w:proofErr w:type="gramEnd"/>
     </w:p>
     <w:tbl>
       <w:tblPr>
@@ -6640,7 +6855,15 @@
         <w:spacing w:before="40" w:after="60"/>
       </w:pPr>
       <w:r>
-        <w:t>Fix HGB : class_weight='balanced' au lieu de sample_weight</w:t>
+        <w:t xml:space="preserve">Fix </w:t>
+      </w:r>
+      <w:proofErr w:type="gramStart"/>
+      <w:r>
+        <w:t>HGB :</w:t>
+      </w:r>
+      <w:proofErr w:type="gramEnd"/>
+      <w:r>
+        <w:t xml:space="preserve"> class_weight='balanced' au lieu de sample_weight</w:t>
       </w:r>
     </w:p>
     <w:p>
@@ -8620,7 +8843,23 @@
           <w:color w:val="000000"/>
           <w:lang w:val="fr-FR"/>
         </w:rPr>
-        <w:t>Ce notebook genere des labels physiquement coherents a partir de formules mathematiques appliquees aux valeurs reelles des capteurs. Cette approche produit des classes discriminantes et des performances elevees.</w:t>
+        <w:t xml:space="preserve">Ce notebook genere des labels physiquement coherents </w:t>
+      </w:r>
+      <w:proofErr w:type="gramStart"/>
+      <w:r>
+        <w:rPr>
+          <w:color w:val="000000"/>
+          <w:lang w:val="fr-FR"/>
+        </w:rPr>
+        <w:t>a</w:t>
+      </w:r>
+      <w:proofErr w:type="gramEnd"/>
+      <w:r>
+        <w:rPr>
+          <w:color w:val="000000"/>
+          <w:lang w:val="fr-FR"/>
+        </w:rPr>
+        <w:t xml:space="preserve"> partir de formules mathematiques appliquees aux valeurs reelles des capteurs. Cette approche produit des classes discriminantes et des performances elevees.</w:t>
       </w:r>
     </w:p>
     <w:p>
@@ -9125,8 +9364,18 @@
           <w:bCs/>
           <w:color w:val="000000"/>
         </w:rPr>
-        <w:t>Z-scores (ecarts normalises) :</w:t>
+        <w:t>Z-scores (ecarts normalises</w:t>
       </w:r>
+      <w:proofErr w:type="gramStart"/>
+      <w:r>
+        <w:rPr>
+          <w:b/>
+          <w:bCs/>
+          <w:color w:val="000000"/>
+        </w:rPr>
+        <w:t>) :</w:t>
+      </w:r>
+      <w:proofErr w:type="gramEnd"/>
     </w:p>
     <w:p>
       <w:pPr>
@@ -9203,8 +9452,18 @@
           <w:bCs/>
           <w:color w:val="000000"/>
         </w:rPr>
-        <w:t>Score Court-Circuit (spike courant + chute tension) :</w:t>
+        <w:t>Score Court-Circuit (spike courant + chute tension</w:t>
       </w:r>
+      <w:proofErr w:type="gramStart"/>
+      <w:r>
+        <w:rPr>
+          <w:b/>
+          <w:bCs/>
+          <w:color w:val="000000"/>
+        </w:rPr>
+        <w:t>) :</w:t>
+      </w:r>
+      <w:proofErr w:type="gramEnd"/>
     </w:p>
     <w:p>
       <w:pPr>
@@ -9291,6 +9550,7 @@
           <w:lang w:val="fr-FR"/>
         </w:rPr>
       </w:pPr>
+      <w:proofErr w:type="gramStart"/>
       <w:r>
         <w:rPr>
           <w:rFonts w:ascii="Courier New" w:eastAsia="Courier New" w:hAnsi="Courier New" w:cs="Courier New"/>
@@ -9299,7 +9559,18 @@
           <w:szCs w:val="18"/>
           <w:lang w:val="fr-FR"/>
         </w:rPr>
-        <w:t>ol_score = 0.45 * z_I + 0.35 * z_T + 0.20 * z_Vib</w:t>
+        <w:t>ol</w:t>
+      </w:r>
+      <w:proofErr w:type="gramEnd"/>
+      <w:r>
+        <w:rPr>
+          <w:rFonts w:ascii="Courier New" w:eastAsia="Courier New" w:hAnsi="Courier New" w:cs="Courier New"/>
+          <w:color w:val="1F4E79"/>
+          <w:sz w:val="18"/>
+          <w:szCs w:val="18"/>
+          <w:lang w:val="fr-FR"/>
+        </w:rPr>
+        <w:t>_score = 0.45 * z_I + 0.35 * z_T + 0.20 * z_Vib</w:t>
       </w:r>
     </w:p>
     <w:p>
@@ -9847,13 +10118,23 @@
                 <w:lang w:val="fr-FR"/>
               </w:rPr>
             </w:pPr>
+            <w:proofErr w:type="gramStart"/>
             <w:r>
               <w:rPr>
                 <w:sz w:val="20"/>
                 <w:szCs w:val="20"/>
                 <w:lang w:val="fr-FR"/>
               </w:rPr>
-              <w:t>ol_score &gt; 0.6 (et cc_score &lt;= 1.5)</w:t>
+              <w:t>ol</w:t>
+            </w:r>
+            <w:proofErr w:type="gramEnd"/>
+            <w:r>
+              <w:rPr>
+                <w:sz w:val="20"/>
+                <w:szCs w:val="20"/>
+                <w:lang w:val="fr-FR"/>
+              </w:rPr>
+              <w:t>_score &gt; 0.6 (et cc_score &lt;= 1.5)</w:t>
             </w:r>
           </w:p>
         </w:tc>
@@ -14289,12 +14570,37 @@
             </w:tcMar>
           </w:tcPr>
           <w:p>
-            <w:r>
-              <w:rPr>
-                <w:sz w:val="20"/>
-                <w:szCs w:val="20"/>
-              </w:rPr>
-              <w:t>pandas.read_csv()</w:t>
+            <w:proofErr w:type="gramStart"/>
+            <w:r>
+              <w:rPr>
+                <w:sz w:val="20"/>
+                <w:szCs w:val="20"/>
+              </w:rPr>
+              <w:t>pandas.read</w:t>
+            </w:r>
+            <w:proofErr w:type="gramEnd"/>
+            <w:r>
+              <w:rPr>
+                <w:sz w:val="20"/>
+                <w:szCs w:val="20"/>
+              </w:rPr>
+              <w:t>_</w:t>
+            </w:r>
+            <w:proofErr w:type="gramStart"/>
+            <w:r>
+              <w:rPr>
+                <w:sz w:val="20"/>
+                <w:szCs w:val="20"/>
+              </w:rPr>
+              <w:t>csv(</w:t>
+            </w:r>
+            <w:proofErr w:type="gramEnd"/>
+            <w:r>
+              <w:rPr>
+                <w:sz w:val="20"/>
+                <w:szCs w:val="20"/>
+              </w:rPr>
+              <w:t>)</w:t>
             </w:r>
           </w:p>
         </w:tc>
@@ -14372,12 +14678,21 @@
             </w:tcMar>
           </w:tcPr>
           <w:p>
-            <w:r>
-              <w:rPr>
-                <w:sz w:val="20"/>
-                <w:szCs w:val="20"/>
-              </w:rPr>
-              <w:t>df.apply(lambda)</w:t>
+            <w:proofErr w:type="gramStart"/>
+            <w:r>
+              <w:rPr>
+                <w:sz w:val="20"/>
+                <w:szCs w:val="20"/>
+              </w:rPr>
+              <w:t>df.apply</w:t>
+            </w:r>
+            <w:proofErr w:type="gramEnd"/>
+            <w:r>
+              <w:rPr>
+                <w:sz w:val="20"/>
+                <w:szCs w:val="20"/>
+              </w:rPr>
+              <w:t>(lambda)</w:t>
             </w:r>
           </w:p>
         </w:tc>
@@ -14727,7 +15042,23 @@
                 <w:sz w:val="20"/>
                 <w:szCs w:val="20"/>
               </w:rPr>
-              <w:t>balanced_subsample()</w:t>
+              <w:t>balanced_</w:t>
+            </w:r>
+            <w:proofErr w:type="gramStart"/>
+            <w:r>
+              <w:rPr>
+                <w:sz w:val="20"/>
+                <w:szCs w:val="20"/>
+              </w:rPr>
+              <w:t>subsample(</w:t>
+            </w:r>
+            <w:proofErr w:type="gramEnd"/>
+            <w:r>
+              <w:rPr>
+                <w:sz w:val="20"/>
+                <w:szCs w:val="20"/>
+              </w:rPr>
+              <w:t>)</w:t>
             </w:r>
           </w:p>
         </w:tc>
@@ -14900,12 +15231,21 @@
             </w:tcMar>
           </w:tcPr>
           <w:p>
-            <w:r>
-              <w:rPr>
-                <w:sz w:val="20"/>
-                <w:szCs w:val="20"/>
-              </w:rPr>
-              <w:t>joblib.dump()</w:t>
+            <w:proofErr w:type="gramStart"/>
+            <w:r>
+              <w:rPr>
+                <w:sz w:val="20"/>
+                <w:szCs w:val="20"/>
+              </w:rPr>
+              <w:t>joblib.dump</w:t>
+            </w:r>
+            <w:proofErr w:type="gramEnd"/>
+            <w:r>
+              <w:rPr>
+                <w:sz w:val="20"/>
+                <w:szCs w:val="20"/>
+              </w:rPr>
+              <w:t>()</w:t>
             </w:r>
           </w:p>
         </w:tc>
@@ -15251,12 +15591,21 @@
             </w:tcMar>
           </w:tcPr>
           <w:p>
-            <w:r>
-              <w:rPr>
-                <w:sz w:val="20"/>
-                <w:szCs w:val="20"/>
-              </w:rPr>
-              <w:t>Calcul : n_total / (n_classes * count_classe)</w:t>
+            <w:proofErr w:type="gramStart"/>
+            <w:r>
+              <w:rPr>
+                <w:sz w:val="20"/>
+                <w:szCs w:val="20"/>
+              </w:rPr>
+              <w:t>Calcul :</w:t>
+            </w:r>
+            <w:proofErr w:type="gramEnd"/>
+            <w:r>
+              <w:rPr>
+                <w:sz w:val="20"/>
+                <w:szCs w:val="20"/>
+              </w:rPr>
+              <w:t xml:space="preserve"> n_total / (n_classes * count_classe)</w:t>
             </w:r>
           </w:p>
         </w:tc>
@@ -15339,7 +15688,23 @@
                 <w:sz w:val="20"/>
                 <w:szCs w:val="20"/>
               </w:rPr>
-              <w:t>balanced_subsample(X, y, max_per_class=5000)</w:t>
+              <w:t>balanced_</w:t>
+            </w:r>
+            <w:proofErr w:type="gramStart"/>
+            <w:r>
+              <w:rPr>
+                <w:sz w:val="20"/>
+                <w:szCs w:val="20"/>
+              </w:rPr>
+              <w:t>subsample(</w:t>
+            </w:r>
+            <w:proofErr w:type="gramEnd"/>
+            <w:r>
+              <w:rPr>
+                <w:sz w:val="20"/>
+                <w:szCs w:val="20"/>
+              </w:rPr>
+              <w:t>X, y, max_per_class=5000)</w:t>
             </w:r>
           </w:p>
         </w:tc>
@@ -15615,12 +15980,21 @@
             </w:tcMar>
           </w:tcPr>
           <w:p>
-            <w:r>
-              <w:rPr>
-                <w:sz w:val="20"/>
-                <w:szCs w:val="20"/>
-              </w:rPr>
-              <w:t>moyenne(F1 par classe)</w:t>
+            <w:proofErr w:type="gramStart"/>
+            <w:r>
+              <w:rPr>
+                <w:sz w:val="20"/>
+                <w:szCs w:val="20"/>
+              </w:rPr>
+              <w:t>moyenne(</w:t>
+            </w:r>
+            <w:proofErr w:type="gramEnd"/>
+            <w:r>
+              <w:rPr>
+                <w:sz w:val="20"/>
+                <w:szCs w:val="20"/>
+              </w:rPr>
+              <w:t>F1 par classe)</w:t>
             </w:r>
           </w:p>
         </w:tc>
@@ -15787,12 +16161,21 @@
             </w:tcMar>
           </w:tcPr>
           <w:p>
-            <w:r>
-              <w:rPr>
-                <w:sz w:val="20"/>
-                <w:szCs w:val="20"/>
-              </w:rPr>
-              <w:t>moyenne(P par classe)</w:t>
+            <w:proofErr w:type="gramStart"/>
+            <w:r>
+              <w:rPr>
+                <w:sz w:val="20"/>
+                <w:szCs w:val="20"/>
+              </w:rPr>
+              <w:t>moyenne(</w:t>
+            </w:r>
+            <w:proofErr w:type="gramEnd"/>
+            <w:r>
+              <w:rPr>
+                <w:sz w:val="20"/>
+                <w:szCs w:val="20"/>
+              </w:rPr>
+              <w:t>P par classe)</w:t>
             </w:r>
           </w:p>
         </w:tc>
@@ -15870,12 +16253,21 @@
             </w:tcMar>
           </w:tcPr>
           <w:p>
-            <w:r>
-              <w:rPr>
-                <w:sz w:val="20"/>
-                <w:szCs w:val="20"/>
-              </w:rPr>
-              <w:t>moyenne(R par classe)</w:t>
+            <w:proofErr w:type="gramStart"/>
+            <w:r>
+              <w:rPr>
+                <w:sz w:val="20"/>
+                <w:szCs w:val="20"/>
+              </w:rPr>
+              <w:t>moyenne(</w:t>
+            </w:r>
+            <w:proofErr w:type="gramEnd"/>
+            <w:r>
+              <w:rPr>
+                <w:sz w:val="20"/>
+                <w:szCs w:val="20"/>
+              </w:rPr>
+              <w:t>R par classe)</w:t>
             </w:r>
           </w:p>
         </w:tc>
@@ -16864,7 +17256,23 @@
           <w:color w:val="000000"/>
           <w:lang w:val="fr-FR"/>
         </w:rPr>
-        <w:t>KNN obtient des resultats inferieurs a tous les autres algorithmes dans les deux versions. Cette limitation s'explique par la 'malediction de la dimensionnalite' : avec 8 features, la notion de 'voisin proche' perd de sa signification. De plus, KNN ne supporte pas class_weight et depend entierement de l'undersample pour gerer le desequilibre.</w:t>
+        <w:t xml:space="preserve">KNN obtient des resultats inferieurs </w:t>
+      </w:r>
+      <w:proofErr w:type="gramStart"/>
+      <w:r>
+        <w:rPr>
+          <w:color w:val="000000"/>
+          <w:lang w:val="fr-FR"/>
+        </w:rPr>
+        <w:t>a</w:t>
+      </w:r>
+      <w:proofErr w:type="gramEnd"/>
+      <w:r>
+        <w:rPr>
+          <w:color w:val="000000"/>
+          <w:lang w:val="fr-FR"/>
+        </w:rPr>
+        <w:t xml:space="preserve"> tous les autres algorithmes dans les deux versions. Cette limitation s'explique par la 'malediction de la dimensionnalite' : avec 8 features, la notion de 'voisin proche' perd de sa signification. De plus, KNN ne supporte pas class_weight et depend entierement de l'undersample pour gerer le desequilibre.</w:t>
       </w:r>
     </w:p>
     <w:p>
@@ -17087,13 +17495,23 @@
                 <w:lang w:val="fr-FR"/>
               </w:rPr>
             </w:pPr>
+            <w:proofErr w:type="gramStart"/>
             <w:r>
               <w:rPr>
                 <w:sz w:val="20"/>
                 <w:szCs w:val="20"/>
                 <w:lang w:val="fr-FR"/>
               </w:rPr>
-              <w:t>pip install automatique des librairies</w:t>
+              <w:t>pip</w:t>
+            </w:r>
+            <w:proofErr w:type="gramEnd"/>
+            <w:r>
+              <w:rPr>
+                <w:sz w:val="20"/>
+                <w:szCs w:val="20"/>
+                <w:lang w:val="fr-FR"/>
+              </w:rPr>
+              <w:t xml:space="preserve"> install automatique des librairies</w:t>
             </w:r>
           </w:p>
         </w:tc>
@@ -17447,7 +17865,23 @@
                 <w:sz w:val="20"/>
                 <w:szCs w:val="20"/>
               </w:rPr>
-              <w:t>80/20 stratifie, StandardScaler, balanced_subsample()</w:t>
+              <w:t>80/20 stratifie, StandardScaler, balanced_</w:t>
+            </w:r>
+            <w:proofErr w:type="gramStart"/>
+            <w:r>
+              <w:rPr>
+                <w:sz w:val="20"/>
+                <w:szCs w:val="20"/>
+              </w:rPr>
+              <w:t>subsample(</w:t>
+            </w:r>
+            <w:proofErr w:type="gramEnd"/>
+            <w:r>
+              <w:rPr>
+                <w:sz w:val="20"/>
+                <w:szCs w:val="20"/>
+              </w:rPr>
+              <w:t>)</w:t>
             </w:r>
           </w:p>
         </w:tc>
@@ -17795,7 +18229,25 @@
                 <w:szCs w:val="20"/>
                 <w:lang w:val="fr-FR"/>
               </w:rPr>
-              <w:t>7 fichiers .joblib dans outputs_v6b/</w:t>
+              <w:t xml:space="preserve">7 </w:t>
+            </w:r>
+            <w:proofErr w:type="gramStart"/>
+            <w:r>
+              <w:rPr>
+                <w:sz w:val="20"/>
+                <w:szCs w:val="20"/>
+                <w:lang w:val="fr-FR"/>
+              </w:rPr>
+              <w:t>fichiers .joblib</w:t>
+            </w:r>
+            <w:proofErr w:type="gramEnd"/>
+            <w:r>
+              <w:rPr>
+                <w:sz w:val="20"/>
+                <w:szCs w:val="20"/>
+                <w:lang w:val="fr-FR"/>
+              </w:rPr>
+              <w:t xml:space="preserve"> dans outputs_v6b/</w:t>
             </w:r>
           </w:p>
         </w:tc>
@@ -17851,7 +18303,23 @@
                 <w:sz w:val="20"/>
                 <w:szCs w:val="20"/>
               </w:rPr>
-              <w:t>predict_motor() avec 8 parametres capteurs</w:t>
+              <w:t>predict_</w:t>
+            </w:r>
+            <w:proofErr w:type="gramStart"/>
+            <w:r>
+              <w:rPr>
+                <w:sz w:val="20"/>
+                <w:szCs w:val="20"/>
+              </w:rPr>
+              <w:t>motor(</w:t>
+            </w:r>
+            <w:proofErr w:type="gramEnd"/>
+            <w:r>
+              <w:rPr>
+                <w:sz w:val="20"/>
+                <w:szCs w:val="20"/>
+              </w:rPr>
+              <w:t>) avec 8 parametres capteurs</w:t>
             </w:r>
           </w:p>
         </w:tc>
@@ -17863,7 +18331,15 @@
         <w:pStyle w:val="Heading2"/>
       </w:pPr>
       <w:r>
-        <w:t>8.2 v7 — dc_motor_fault_diagnosis_v7.ipynb (48 cellules)</w:t>
+        <w:t>8.2 v7 — dc_motor_fault_diagnosis_v</w:t>
+      </w:r>
+      <w:proofErr w:type="gramStart"/>
+      <w:r>
+        <w:t>7.ipynb</w:t>
+      </w:r>
+      <w:proofErr w:type="gramEnd"/>
+      <w:r>
+        <w:t xml:space="preserve"> (48 cellules)</w:t>
       </w:r>
     </w:p>
     <w:tbl>
@@ -18637,7 +19113,23 @@
                 <w:sz w:val="20"/>
                 <w:szCs w:val="20"/>
               </w:rPr>
-              <w:t>8 fichiers .joblib dans outputs/</w:t>
+              <w:t xml:space="preserve">8 </w:t>
+            </w:r>
+            <w:proofErr w:type="gramStart"/>
+            <w:r>
+              <w:rPr>
+                <w:sz w:val="20"/>
+                <w:szCs w:val="20"/>
+              </w:rPr>
+              <w:t>fichiers .joblib</w:t>
+            </w:r>
+            <w:proofErr w:type="gramEnd"/>
+            <w:r>
+              <w:rPr>
+                <w:sz w:val="20"/>
+                <w:szCs w:val="20"/>
+              </w:rPr>
+              <w:t xml:space="preserve"> dans outputs/</w:t>
             </w:r>
           </w:p>
         </w:tc>
@@ -18693,13 +19185,41 @@
                 <w:lang w:val="fr-FR"/>
               </w:rPr>
             </w:pPr>
+            <w:proofErr w:type="gramStart"/>
             <w:r>
               <w:rPr>
                 <w:sz w:val="20"/>
                 <w:szCs w:val="20"/>
                 <w:lang w:val="fr-FR"/>
               </w:rPr>
-              <w:t>predict_motor() avec verification par les formules physiques</w:t>
+              <w:t>predict</w:t>
+            </w:r>
+            <w:proofErr w:type="gramEnd"/>
+            <w:r>
+              <w:rPr>
+                <w:sz w:val="20"/>
+                <w:szCs w:val="20"/>
+                <w:lang w:val="fr-FR"/>
+              </w:rPr>
+              <w:t>_</w:t>
+            </w:r>
+            <w:proofErr w:type="gramStart"/>
+            <w:r>
+              <w:rPr>
+                <w:sz w:val="20"/>
+                <w:szCs w:val="20"/>
+                <w:lang w:val="fr-FR"/>
+              </w:rPr>
+              <w:t>motor(</w:t>
+            </w:r>
+            <w:proofErr w:type="gramEnd"/>
+            <w:r>
+              <w:rPr>
+                <w:sz w:val="20"/>
+                <w:szCs w:val="20"/>
+                <w:lang w:val="fr-FR"/>
+              </w:rPr>
+              <w:t>) avec verification par les formules physiques</w:t>
             </w:r>
           </w:p>
         </w:tc>
@@ -18770,7 +19290,23 @@
           <w:color w:val="000000"/>
           <w:lang w:val="fr-FR"/>
         </w:rPr>
-        <w:t>Ce projet a abouti a la creation de deux notebooks complets et complementaires pour le diagnostic de moteurs DC 12V par Machine Learning. Cinq algorithmes ont ete implementes, compares et documentes de maniere rigoureuse.</w:t>
+        <w:t xml:space="preserve">Ce projet a abouti </w:t>
+      </w:r>
+      <w:proofErr w:type="gramStart"/>
+      <w:r>
+        <w:rPr>
+          <w:color w:val="000000"/>
+          <w:lang w:val="fr-FR"/>
+        </w:rPr>
+        <w:t>a</w:t>
+      </w:r>
+      <w:proofErr w:type="gramEnd"/>
+      <w:r>
+        <w:rPr>
+          <w:color w:val="000000"/>
+          <w:lang w:val="fr-FR"/>
+        </w:rPr>
+        <w:t xml:space="preserve"> la creation de deux notebooks complets et complementaires pour le diagnostic de moteurs DC 12V par Machine Learning. Cinq algorithmes ont ete implementes, compares et documentes de maniere rigoureuse.</w:t>
       </w:r>
     </w:p>
     <w:p>
@@ -18783,8 +19319,18 @@
           <w:bCs/>
           <w:color w:val="000000"/>
         </w:rPr>
-        <w:t>Points cles accomplis :</w:t>
+        <w:t xml:space="preserve">Points cles </w:t>
       </w:r>
+      <w:proofErr w:type="gramStart"/>
+      <w:r>
+        <w:rPr>
+          <w:b/>
+          <w:bCs/>
+          <w:color w:val="000000"/>
+        </w:rPr>
+        <w:t>accomplis :</w:t>
+      </w:r>
+      <w:proofErr w:type="gramEnd"/>
     </w:p>
     <w:p>
       <w:pPr>
@@ -18904,7 +19450,15 @@
         <w:spacing w:before="40" w:after="60"/>
       </w:pPr>
       <w:r>
-        <w:t>Visualisations completes : confusion matrices, heatmaps F1, feature importance</w:t>
+        <w:t xml:space="preserve">Visualisations </w:t>
+      </w:r>
+      <w:proofErr w:type="gramStart"/>
+      <w:r>
+        <w:t>completes :</w:t>
+      </w:r>
+      <w:proofErr w:type="gramEnd"/>
+      <w:r>
+        <w:t xml:space="preserve"> confusion matrices, heatmaps F1, feature importance</w:t>
       </w:r>
     </w:p>
     <w:p/>
@@ -19121,13 +19675,23 @@
                 <w:lang w:val="fr-FR"/>
               </w:rPr>
             </w:pPr>
+            <w:proofErr w:type="gramStart"/>
             <w:r>
               <w:rPr>
                 <w:sz w:val="20"/>
                 <w:szCs w:val="20"/>
                 <w:lang w:val="fr-FR"/>
               </w:rPr>
-              <w:t>class_weight est toujours preferable pour les arbres et SVM. L'oversampling cause des problemes de performance et de qualite</w:t>
+              <w:t>class</w:t>
+            </w:r>
+            <w:proofErr w:type="gramEnd"/>
+            <w:r>
+              <w:rPr>
+                <w:sz w:val="20"/>
+                <w:szCs w:val="20"/>
+                <w:lang w:val="fr-FR"/>
+              </w:rPr>
+              <w:t>_weight est toujours preferable pour les arbres et SVM. L'oversampling cause des problemes de performance et de qualite</w:t>
             </w:r>
           </w:p>
         </w:tc>
@@ -19430,7 +19994,21 @@
         <w:rPr>
           <w:lang w:val="fr-FR"/>
         </w:rPr>
-        <w:t>Utiliser un dataset avec un signal reel entre les capteurs et les pannes (ex: NASA CMAPS, CWRU Bearing Dataset)</w:t>
+        <w:t>Utiliser un dataset avec un signal reel entre les capteurs et les pannes (</w:t>
+      </w:r>
+      <w:proofErr w:type="gramStart"/>
+      <w:r>
+        <w:rPr>
+          <w:lang w:val="fr-FR"/>
+        </w:rPr>
+        <w:t>ex:</w:t>
+      </w:r>
+      <w:proofErr w:type="gramEnd"/>
+      <w:r>
+        <w:rPr>
+          <w:lang w:val="fr-FR"/>
+        </w:rPr>
+        <w:t xml:space="preserve"> NASA CMAPS, CWRU Bearing Dataset)</w:t>
       </w:r>
     </w:p>
     <w:p>
@@ -19892,8 +20470,17 @@
                 <w:sz w:val="20"/>
                 <w:szCs w:val="20"/>
               </w:rPr>
-              <w:t>dc_motor_fault_diagnosis_v7.ipynb</w:t>
-            </w:r>
+              <w:t>dc_motor_fault_diagnosis_v</w:t>
+            </w:r>
+            <w:proofErr w:type="gramStart"/>
+            <w:r>
+              <w:rPr>
+                <w:sz w:val="20"/>
+                <w:szCs w:val="20"/>
+              </w:rPr>
+              <w:t>7.ipynb</w:t>
+            </w:r>
+            <w:proofErr w:type="gramEnd"/>
           </w:p>
         </w:tc>
         <w:tc>
@@ -22653,13 +23240,41 @@
                 <w:lang w:val="fr-FR"/>
               </w:rPr>
             </w:pPr>
+            <w:proofErr w:type="gramStart"/>
             <w:r>
               <w:rPr>
                 <w:sz w:val="20"/>
                 <w:szCs w:val="20"/>
                 <w:lang w:val="fr-FR"/>
               </w:rPr>
-              <w:t>Macro: donne meme poids a chaque classe. Weighted: ponderee par le nombre d'echantillons</w:t>
+              <w:t>Macro:</w:t>
+            </w:r>
+            <w:proofErr w:type="gramEnd"/>
+            <w:r>
+              <w:rPr>
+                <w:sz w:val="20"/>
+                <w:szCs w:val="20"/>
+                <w:lang w:val="fr-FR"/>
+              </w:rPr>
+              <w:t xml:space="preserve"> donne meme poids a chaque classe. </w:t>
+            </w:r>
+            <w:proofErr w:type="gramStart"/>
+            <w:r>
+              <w:rPr>
+                <w:sz w:val="20"/>
+                <w:szCs w:val="20"/>
+                <w:lang w:val="fr-FR"/>
+              </w:rPr>
+              <w:t>Weighted:</w:t>
+            </w:r>
+            <w:proofErr w:type="gramEnd"/>
+            <w:r>
+              <w:rPr>
+                <w:sz w:val="20"/>
+                <w:szCs w:val="20"/>
+                <w:lang w:val="fr-FR"/>
+              </w:rPr>
+              <w:t xml:space="preserve"> ponderee par le nombre d'echantillons</w:t>
             </w:r>
           </w:p>
         </w:tc>

</xml_diff>